<commit_message>
Build TinyDoor book through option 040
</commit_message>
<xml_diff>
--- a/options/book/tiny_door_and_pillow_forts.docx
+++ b/options/book/tiny_door_and_pillow_forts.docx
@@ -28,40 +28,12 @@
     </w:p>
     <w:p>
       <w:r>
-        <w:t>Stay with the sentence a moment longer:</w:t>
-      </w:r>
-    </w:p>
-    <w:p>
-      <w:pPr>
-        <w:pStyle w:val="TinyQuote"/>
-      </w:pPr>
-      <w:r>
-        <w:t>You were never going to make those notes.</w:t>
-      </w:r>
-    </w:p>
-    <w:p>
-      <w:r>
-        <w:t>It is not an excuse. It is not a clever metaphor. It is the sound of a child discovering, too late, that the shame had been assigned to the wrong place.</w:t>
-      </w:r>
-    </w:p>
-    <w:p>
-      <w:r>
-        <w:t>For weeks, I had practiced as if more effort would make the instrument tell the truth. I stared at the sheet music. I watched the room decide where I belonged. I kept returning to the same conclusion: if the notes were wrong, I must be wrong.</w:t>
-      </w:r>
-    </w:p>
-    <w:p>
-      <w:r>
-        <w:t>Then my tutor played the saxophone and sounded like me.</w:t>
-      </w:r>
-    </w:p>
-    <w:p>
-      <w:r>
-        <w:t>That was the first crack in the old story.</w:t>
-      </w:r>
-    </w:p>
-    <w:p>
-      <w:r>
-        <w:t>Not the crack in the mouthpiece. The crack in the explanation.</w:t>
+        <w:t>Stay with the sentence a moment longer: "You were never going to make those notes." In the prelude, the tutor says it because he has finally taken the saxophone apart and found the crack in the mouthpiece. But the sentence lands much deeper than band class. It lands in the place where a child has been practicing in the cold, staring at sheet music until the page almost burns through, trying to make beauty come out of an instrument that will not tell the truth.</w:t>
+      </w:r>
+    </w:p>
+    <w:p>
+      <w:r>
+        <w:t>I had believed the room because children often do. If the notes were wrong, I must be wrong. If I was fourth chair, out of four, the room must have known something true about me. If the first-chair girl looked at me with derision instead of recognition, then maybe even wanting connection was evidence against me. Then my tutor played the same saxophone and sounded like me, and for one strange moment the old explanation cracked open before the mouthpiece did. Maybe the sound had not been a verdict. Maybe the failure had been assigned to the wrong place.</w:t>
       </w:r>
     </w:p>
     <w:p>
@@ -74,32 +46,12 @@
     </w:p>
     <w:p>
       <w:r>
-        <w:t>A broken mouthpiece does more than ruin music.</w:t>
-      </w:r>
-    </w:p>
-    <w:p>
-      <w:r>
-        <w:t>If nobody checks it, it teaches the player to suspect their own body. Their mouth. Their hands. Their breath. Their focus. Their worth.</w:t>
-      </w:r>
-    </w:p>
-    <w:p>
-      <w:r>
-        <w:t>That is how shame gets mistaken for feedback.</w:t>
-      </w:r>
-    </w:p>
-    <w:p>
-      <w:r>
-        <w:t>A room can be very certain and still be wrong. A teacher can be kind and still miss the thing that matters. A child can work harder and harder inside a setup that was never going to let the music come through.</w:t>
-      </w:r>
-    </w:p>
-    <w:p>
-      <w:r>
-        <w:t>And because the child is a child, they usually do not inspect the instrument.</w:t>
-      </w:r>
-    </w:p>
-    <w:p>
-      <w:r>
-        <w:t>They inspect themselves.</w:t>
+        <w:t>A broken mouthpiece does more than ruin music when nobody checks it. It teaches the player to suspect their own body, their mouth, their hands, their breath, their focus, their worth. A room can be very certain and still be wrong. An adult can be kind and still miss the thing that matters. A child can work harder and harder inside a setup that was never going to let the music come through, then carry the shame as if shame were feedback.</w:t>
+      </w:r>
+    </w:p>
+    <w:p>
+      <w:r>
+        <w:t>That is one way a life gets misread. The person is asked to improve before anyone inspects the instrument. The body is blamed before anyone checks the room. The child is told to practice harder, mask better, sit still, try again, make the notes, make friends, be easier to love, and all the while there may be a crack somewhere nobody bothered to notice.</w:t>
       </w:r>
     </w:p>
     <w:p>
@@ -112,47 +64,12 @@
     </w:p>
     <w:p>
       <w:r>
-        <w:t>This book begins there: not with the claim that effort never matters, or that every hard thing is someone else’s fault, but with a more merciful first question.</w:t>
-      </w:r>
-    </w:p>
-    <w:p>
-      <w:r>
-        <w:t>Before we indict the person, can we inspect the instrument?</w:t>
-      </w:r>
-    </w:p>
-    <w:p>
-      <w:r>
-        <w:t>Maybe the tool is wrong.</w:t>
-      </w:r>
-    </w:p>
-    <w:p>
-      <w:r>
-        <w:t>Maybe the room is wrong.</w:t>
-      </w:r>
-    </w:p>
-    <w:p>
-      <w:r>
-        <w:t>Maybe the expectation is wrong.</w:t>
-      </w:r>
-    </w:p>
-    <w:p>
-      <w:r>
-        <w:t>Maybe the person has been practicing through a crack no one else bothered to notice.</w:t>
-      </w:r>
-    </w:p>
-    <w:p>
-      <w:r>
-        <w:t>That possibility matters because shame is not neutral. It does not simply describe pain. It recruits the person into blaming themselves for pain that may have been designed, permitted, neglected, or misread.</w:t>
-      </w:r>
-    </w:p>
-    <w:p>
-      <w:r>
-        <w:t>A cracked mouthpiece is not a failed musician.</w:t>
-      </w:r>
-    </w:p>
-    <w:p>
-      <w:r>
-        <w:t>A hostile room is not a failed nervous system.</w:t>
+        <w:t>This book begins with a more merciful first question. Before we indict the player, can we inspect the instrument? Not because effort never matters. Not because every hard thing is someone else’s fault. Not because we never have skills to learn, repairs to make, apologies to offer, or supports to build. But because a life cannot be built honestly if the first assumption is that the vulnerable person is the defect.</w:t>
+      </w:r>
+    </w:p>
+    <w:p>
+      <w:r>
+        <w:t>Sometimes the tool is wrong. Sometimes the room is wrong. Sometimes the expectation is wrong. Sometimes the person has been practicing through a crack no one else bothered to notice, and the most honest beginning is not self-improvement. It is a pause in the old blame pattern long enough to ask whether the story we inherited is true.</w:t>
       </w:r>
     </w:p>
     <w:p>
@@ -165,45 +82,7 @@
     </w:p>
     <w:p>
       <w:r>
-        <w:t>Think of one place where you have been trying harder for a long time and the notes still will not come.</w:t>
-      </w:r>
-    </w:p>
-    <w:p>
-      <w:r>
-        <w:t>Do not solve it yet.</w:t>
-      </w:r>
-    </w:p>
-    <w:p>
-      <w:r>
-        <w:t>Do not quit yet.</w:t>
-      </w:r>
-    </w:p>
-    <w:p>
-      <w:r>
-        <w:t>Do not turn it into a whole life verdict.</w:t>
-      </w:r>
-    </w:p>
-    <w:p>
-      <w:r>
-        <w:t>Just pause the old conclusion long enough to ask:</w:t>
-      </w:r>
-    </w:p>
-    <w:p>
-      <w:pPr>
-        <w:pStyle w:val="TinyQuote"/>
-      </w:pPr>
-      <w:r>
-        <w:t>What if the mouthpiece is cracked?</w:t>
-      </w:r>
-    </w:p>
-    <w:p>
-      <w:r>
-        <w:t>That question may not fix the instrument today.</w:t>
-      </w:r>
-    </w:p>
-    <w:p>
-      <w:r>
-        <w:t>But it can loosen the shame.</w:t>
+        <w:t>Think of one place where you have been trying harder for a long time and the notes still will not come. Keep it small enough to hold. Do not solve it yet, and do not turn it into a verdict about your whole life. Just pause the old conclusion long enough to ask: what if the mouthpiece is cracked? That question may not fix the instrument today, but it can loosen the shame, and loosening the shame is already a door.</w:t>
       </w:r>
     </w:p>
     <w:p>
@@ -216,22 +95,7 @@
     </w:p>
     <w:p>
       <w:r>
-        <w:t>You are allowed to inspect the instrument before you condemn the player.</w:t>
-      </w:r>
-    </w:p>
-    <w:p>
-      <w:r>
-        <w:t>You are allowed to wonder whether the room, the tool, the demand, or the explanation has been wrong.</w:t>
-      </w:r>
-    </w:p>
-    <w:p>
-      <w:r>
-        <w:t>You may have been trying to make music through a broken mouthpiece for a very long time.</w:t>
-      </w:r>
-    </w:p>
-    <w:p>
-      <w:r>
-        <w:t>That does not mean you were broken.</w:t>
+        <w:t>You are allowed to inspect the instrument before you condemn the player. You are allowed to wonder whether the room, the tool, the demand, or the explanation has been wrong. You may have been trying to make music through a broken mouthpiece for a very long time, and that does not mean you were broken.</w:t>
       </w:r>
     </w:p>
     <w:p>

</xml_diff>